<commit_message>
Dashboard v2: live-only 3D relief map (deck.gl), white/green agri theme, 10-min auto-refresh
- Removed demo mode from dashboard: always live 2026 signals, parallel fetch
  (5 workers + retry), offline cache as automatic per-district fallback
- deck.gl 3D extruded districts (height & colour = FSI) + 2D choropleth toggle
- Light agriculture theme (.streamlit/config.toml) with subtle animated
  background fields, hover-lift KPI cards, pulsing LIVE badge with timestamp
- Officer alert now includes transient farmer callback number (never persisted;
  storage stays hashed) + Round 1 doc honesty fixes from external review

Co-Authored-By: Pranav Shripannavar <shripannavarpranav@gmail.com>
</commit_message>
<xml_diff>
--- a/docs/KisaanRaksha_Round1_Solution.docx
+++ b/docs/KisaanRaksha_Round1_Solution.docx
@@ -690,7 +690,7 @@
                 <w:sz w:val="18"/>
                 <w:szCs w:val="18"/>
               </w:rPr>
-              <w:t xml:space="preserve">FSI raised in live demo → alert + claim fired</w:t>
+              <w:t xml:space="preserve">FSI in labeled crisis simulation → alert + claim fired on a real phone</w:t>
             </w:r>
           </w:p>
         </w:tc>
@@ -2291,7 +2291,7 @@
           <w:sz w:val="26"/>
           <w:szCs w:val="26"/>
         </w:rPr>
-        <w:t xml:space="preserve">4.2  The FSI model</w:t>
+        <w:t xml:space="preserve">4.2  The FSI model — and what its metrics do and do not mean</w:t>
       </w:r>
     </w:p>
     <w:p>
@@ -2322,7 +2322,7 @@
           <w:sz w:val="22"/>
           <w:szCs w:val="22"/>
         </w:rPr>
-        <w:t xml:space="preserve"> — the honest test for geographic generalization.</w:t>
+        <w:t xml:space="preserve">.</w:t>
       </w:r>
     </w:p>
     <w:tbl>
@@ -2370,7 +2370,7 @@
                 <w:sz w:val="20"/>
                 <w:szCs w:val="20"/>
               </w:rPr>
-              <w:t xml:space="preserve">Metric (held-out talukas)</w:t>
+              <w:t xml:space="preserve">Consistency check on synthetic data (held-out talukas)</w:t>
             </w:r>
           </w:p>
         </w:tc>
@@ -2649,11 +2649,76 @@
       <w:r>
         <w:rPr>
           <w:rFonts w:ascii="Calibri" w:cs="Calibri" w:eastAsia="Calibri" w:hAnsi="Calibri"/>
+          <w:b/>
+          <w:bCs/>
+          <w:color w:val="B71C1C"/>
+          <w:sz w:val="22"/>
+          <w:szCs w:val="22"/>
+        </w:rPr>
+        <w:t xml:space="preserve">What these numbers mean — stated plainly: </w:t>
+      </w:r>
+      <w:r>
+        <w:rPr>
+          <w:rFonts w:ascii="Calibri" w:cs="Calibri" w:eastAsia="Calibri" w:hAnsi="Calibri"/>
+          <w:sz w:val="22"/>
+          <w:szCs w:val="22"/>
+        </w:rPr>
+        <w:t xml:space="preserve">the synthetic labels are generated by our own domain-logic formula (weighted signals + coincidence interactions + noise), so on this data the model is recovering a function we designed. These metrics therefore measure </w:t>
+      </w:r>
+      <w:r>
+        <w:rPr>
+          <w:rFonts w:ascii="Calibri" w:cs="Calibri" w:eastAsia="Calibri" w:hAnsi="Calibri"/>
+          <w:b/>
+          <w:bCs/>
+          <w:sz w:val="22"/>
+          <w:szCs w:val="22"/>
+        </w:rPr>
+        <w:t xml:space="preserve">internal consistency of the pipeline — that the model faithfully encodes the domain logic and generalizes it across unseen talukas — not real-world predictive power. </w:t>
+      </w:r>
+      <w:r>
+        <w:rPr>
+          <w:rFonts w:ascii="Calibri" w:cs="Calibri" w:eastAsia="Calibri" w:hAnsi="Calibri"/>
+          <w:sz w:val="22"/>
+          <w:szCs w:val="22"/>
+        </w:rPr>
+        <w:t xml:space="preserve">Real validation is exactly what the pilot in Section 8 is designed to produce: alert precision measured against officer-verified ground truth over one monsoon season. We consider it a feature of this submission that the ML claim is scoped honestly.</w:t>
+      </w:r>
+    </w:p>
+    <w:p>
+      <w:pPr>
+        <w:spacing w:after="160" w:before="0"/>
+      </w:pPr>
+      <w:r>
+        <w:rPr>
+          <w:rFonts w:ascii="Calibri" w:cs="Calibri" w:eastAsia="Calibri" w:hAnsi="Calibri"/>
           <w:color w:val="212121"/>
           <w:sz w:val="22"/>
           <w:szCs w:val="22"/>
         </w:rPr>
-        <w:t xml:space="preserve">The label formula encodes the core domain insight: distress spikes when crop failure coincides with the loan-repayment deadline — interaction terms (drought × repayment, price × repayment) amplify the base signal, mirroring the documented Oct–Jan clustering of farmer suicides.</w:t>
+        <w:t xml:space="preserve">The label formula itself encodes the core domain insight: distress spikes when crop failure coincides with the loan-repayment deadline — interaction terms (drought × repayment, price × repayment) amplify the base signal, mirroring the documented Oct–Jan clustering of farmer suicides.</w:t>
+      </w:r>
+    </w:p>
+    <w:p>
+      <w:pPr>
+        <w:spacing w:after="160" w:before="0"/>
+      </w:pPr>
+      <w:r>
+        <w:rPr>
+          <w:rFonts w:ascii="Calibri" w:cs="Calibri" w:eastAsia="Calibri" w:hAnsi="Calibri"/>
+          <w:b/>
+          <w:bCs/>
+          <w:sz w:val="22"/>
+          <w:szCs w:val="22"/>
+        </w:rPr>
+        <w:t xml:space="preserve">Why FSI &gt; 75 as the critical threshold? </w:t>
+      </w:r>
+      <w:r>
+        <w:rPr>
+          <w:rFonts w:ascii="Calibri" w:cs="Calibri" w:eastAsia="Calibri" w:hAnsi="Calibri"/>
+          <w:sz w:val="22"/>
+          <w:szCs w:val="22"/>
+        </w:rPr>
+        <w:t xml:space="preserve">It is a tunable operating point, not a discovered truth: 75 balances alert recall (0.78) against precision (0.83) on the synthetic distribution, i.e. roughly one false alert per four raised. In deployment the threshold is calibrated per district against officer response capacity during the pilot.</w:t>
       </w:r>
     </w:p>
     <w:p>
@@ -3146,7 +3211,7 @@
           <w:sz w:val="22"/>
           <w:szCs w:val="22"/>
         </w:rPr>
-        <w:t xml:space="preserve">The FSI drives officer attention toward or away from farmers, so we audit the critical-alert decision (FSI &gt; 75) on held-out talukas. The harm metric is the false-negative rate — a missed alert is a missed farmer.</w:t>
+        <w:t xml:space="preserve">The FSI drives officer attention toward or away from farmers, so we audit the critical-alert decision (FSI &gt; 75) on held-out talukas. The harm metric — and the one we gate on — is the false-negative rate: a missed alert is a missed farmer.</w:t>
       </w:r>
     </w:p>
     <w:tbl>
@@ -3541,7 +3606,7 @@
                 <w:sz w:val="20"/>
                 <w:szCs w:val="20"/>
               </w:rPr>
-              <w:t xml:space="preserve">Gap (region)</w:t>
+              <w:t xml:space="preserve">Gap across regions</w:t>
             </w:r>
           </w:p>
         </w:tc>
@@ -3597,7 +3662,7 @@
                 <w:sz w:val="20"/>
                 <w:szCs w:val="20"/>
               </w:rPr>
-              <w:t xml:space="preserve">0.024  ✓ &lt; 0.10 gate</w:t>
+              <w:t xml:space="preserve">0.024</w:t>
             </w:r>
           </w:p>
         </w:tc>
@@ -3655,7 +3720,7 @@
                 <w:sz w:val="20"/>
                 <w:szCs w:val="20"/>
               </w:rPr>
-              <w:t xml:space="preserve">Gap (crop: cotton/soy/tur)</w:t>
+              <w:t xml:space="preserve">Gap across crops (cotton/soy/tur)</w:t>
             </w:r>
           </w:p>
         </w:tc>
@@ -3711,7 +3776,7 @@
                 <w:sz w:val="20"/>
                 <w:szCs w:val="20"/>
               </w:rPr>
-              <w:t xml:space="preserve">0.074  ✓ &lt; 0.10 gate</w:t>
+              <w:t xml:space="preserve">0.074</w:t>
             </w:r>
           </w:p>
         </w:tc>
@@ -3750,6 +3815,721 @@
         <w:spacing w:after="60"/>
       </w:pPr>
     </w:p>
+    <w:tbl>
+      <w:tblPr>
+        <w:tblW w:type="dxa" w:w="9360"/>
+        <w:tblBorders>
+          <w:top w:val="single" w:color="auto" w:sz="4"/>
+          <w:left w:val="single" w:color="auto" w:sz="4"/>
+          <w:bottom w:val="single" w:color="auto" w:sz="4"/>
+          <w:right w:val="single" w:color="auto" w:sz="4"/>
+          <w:insideH w:val="single" w:color="auto" w:sz="4"/>
+          <w:insideV w:val="single" w:color="auto" w:sz="4"/>
+        </w:tblBorders>
+      </w:tblPr>
+      <w:tblGrid>
+        <w:gridCol w:w="3276"/>
+        <w:gridCol w:w="2340"/>
+        <w:gridCol w:w="2106"/>
+        <w:gridCol w:w="1638"/>
+      </w:tblGrid>
+      <w:tr>
+        <w:trPr>
+          <w:tblHeader/>
+        </w:trPr>
+        <w:tc>
+          <w:tcPr>
+            <w:tcW w:type="dxa" w:w="3276"/>
+            <w:shd w:fill="1B5E20" w:val="clear"/>
+            <w:tcMar>
+              <w:top w:type="dxa" w:w="60"/>
+              <w:left w:type="dxa" w:w="110"/>
+              <w:bottom w:type="dxa" w:w="60"/>
+              <w:right w:type="dxa" w:w="110"/>
+            </w:tcMar>
+            <w:vAlign w:val="center"/>
+          </w:tcPr>
+          <w:p>
+            <w:pPr>
+              <w:spacing w:after="40" w:before="40"/>
+            </w:pPr>
+            <w:r>
+              <w:rPr>
+                <w:rFonts w:ascii="Calibri" w:cs="Calibri" w:eastAsia="Calibri" w:hAnsi="Calibri"/>
+                <w:b/>
+                <w:bCs/>
+                <w:color w:val="FFFFFF"/>
+                <w:sz w:val="20"/>
+                <w:szCs w:val="20"/>
+              </w:rPr>
+              <w:t xml:space="preserve">Fairness gate</w:t>
+            </w:r>
+          </w:p>
+        </w:tc>
+        <w:tc>
+          <w:tcPr>
+            <w:tcW w:type="dxa" w:w="2340"/>
+            <w:shd w:fill="1B5E20" w:val="clear"/>
+            <w:tcMar>
+              <w:top w:type="dxa" w:w="60"/>
+              <w:left w:type="dxa" w:w="110"/>
+              <w:bottom w:type="dxa" w:w="60"/>
+              <w:right w:type="dxa" w:w="110"/>
+            </w:tcMar>
+            <w:vAlign w:val="center"/>
+          </w:tcPr>
+          <w:p>
+            <w:pPr>
+              <w:spacing w:after="40" w:before="40"/>
+            </w:pPr>
+            <w:r>
+              <w:rPr>
+                <w:rFonts w:ascii="Calibri" w:cs="Calibri" w:eastAsia="Calibri" w:hAnsi="Calibri"/>
+                <w:b/>
+                <w:bCs/>
+                <w:color w:val="FFFFFF"/>
+                <w:sz w:val="20"/>
+                <w:szCs w:val="20"/>
+              </w:rPr>
+              <w:t xml:space="preserve">Threshold</w:t>
+            </w:r>
+          </w:p>
+        </w:tc>
+        <w:tc>
+          <w:tcPr>
+            <w:tcW w:type="dxa" w:w="2106"/>
+            <w:shd w:fill="1B5E20" w:val="clear"/>
+            <w:tcMar>
+              <w:top w:type="dxa" w:w="60"/>
+              <w:left w:type="dxa" w:w="110"/>
+              <w:bottom w:type="dxa" w:w="60"/>
+              <w:right w:type="dxa" w:w="110"/>
+            </w:tcMar>
+            <w:vAlign w:val="center"/>
+          </w:tcPr>
+          <w:p>
+            <w:pPr>
+              <w:spacing w:after="40" w:before="40"/>
+            </w:pPr>
+            <w:r>
+              <w:rPr>
+                <w:rFonts w:ascii="Calibri" w:cs="Calibri" w:eastAsia="Calibri" w:hAnsi="Calibri"/>
+                <w:b/>
+                <w:bCs/>
+                <w:color w:val="FFFFFF"/>
+                <w:sz w:val="20"/>
+                <w:szCs w:val="20"/>
+              </w:rPr>
+              <w:t xml:space="preserve">Observed</w:t>
+            </w:r>
+          </w:p>
+        </w:tc>
+        <w:tc>
+          <w:tcPr>
+            <w:tcW w:type="dxa" w:w="1638"/>
+            <w:shd w:fill="1B5E20" w:val="clear"/>
+            <w:tcMar>
+              <w:top w:type="dxa" w:w="60"/>
+              <w:left w:type="dxa" w:w="110"/>
+              <w:bottom w:type="dxa" w:w="60"/>
+              <w:right w:type="dxa" w:w="110"/>
+            </w:tcMar>
+            <w:vAlign w:val="center"/>
+          </w:tcPr>
+          <w:p>
+            <w:pPr>
+              <w:spacing w:after="40" w:before="40"/>
+            </w:pPr>
+            <w:r>
+              <w:rPr>
+                <w:rFonts w:ascii="Calibri" w:cs="Calibri" w:eastAsia="Calibri" w:hAnsi="Calibri"/>
+                <w:b/>
+                <w:bCs/>
+                <w:color w:val="FFFFFF"/>
+                <w:sz w:val="20"/>
+                <w:szCs w:val="20"/>
+              </w:rPr>
+              <w:t xml:space="preserve">Result</w:t>
+            </w:r>
+          </w:p>
+        </w:tc>
+      </w:tr>
+      <w:tr>
+        <w:tc>
+          <w:tcPr>
+            <w:tcW w:type="dxa" w:w="3276"/>
+            <w:tcMar>
+              <w:top w:type="dxa" w:w="60"/>
+              <w:left w:type="dxa" w:w="110"/>
+              <w:bottom w:type="dxa" w:w="60"/>
+              <w:right w:type="dxa" w:w="110"/>
+            </w:tcMar>
+            <w:vAlign w:val="center"/>
+          </w:tcPr>
+          <w:p>
+            <w:pPr>
+              <w:spacing w:after="40" w:before="40"/>
+            </w:pPr>
+            <w:r>
+              <w:rPr>
+                <w:rFonts w:ascii="Calibri" w:cs="Calibri" w:eastAsia="Calibri" w:hAnsi="Calibri"/>
+                <w:b w:val="false"/>
+                <w:bCs w:val="false"/>
+                <w:color w:val="212121"/>
+                <w:sz w:val="20"/>
+                <w:szCs w:val="20"/>
+              </w:rPr>
+              <w:t xml:space="preserve">FNR gap — region</w:t>
+            </w:r>
+          </w:p>
+        </w:tc>
+        <w:tc>
+          <w:tcPr>
+            <w:tcW w:type="dxa" w:w="2340"/>
+            <w:tcMar>
+              <w:top w:type="dxa" w:w="60"/>
+              <w:left w:type="dxa" w:w="110"/>
+              <w:bottom w:type="dxa" w:w="60"/>
+              <w:right w:type="dxa" w:w="110"/>
+            </w:tcMar>
+            <w:vAlign w:val="center"/>
+          </w:tcPr>
+          <w:p>
+            <w:pPr>
+              <w:spacing w:after="40" w:before="40"/>
+            </w:pPr>
+            <w:r>
+              <w:rPr>
+                <w:rFonts w:ascii="Calibri" w:cs="Calibri" w:eastAsia="Calibri" w:hAnsi="Calibri"/>
+                <w:b w:val="false"/>
+                <w:bCs w:val="false"/>
+                <w:color w:val="212121"/>
+                <w:sz w:val="20"/>
+                <w:szCs w:val="20"/>
+              </w:rPr>
+              <w:t xml:space="preserve">&lt; 0.10</w:t>
+            </w:r>
+          </w:p>
+        </w:tc>
+        <w:tc>
+          <w:tcPr>
+            <w:tcW w:type="dxa" w:w="2106"/>
+            <w:tcMar>
+              <w:top w:type="dxa" w:w="60"/>
+              <w:left w:type="dxa" w:w="110"/>
+              <w:bottom w:type="dxa" w:w="60"/>
+              <w:right w:type="dxa" w:w="110"/>
+            </w:tcMar>
+            <w:vAlign w:val="center"/>
+          </w:tcPr>
+          <w:p>
+            <w:pPr>
+              <w:spacing w:after="40" w:before="40"/>
+            </w:pPr>
+            <w:r>
+              <w:rPr>
+                <w:rFonts w:ascii="Calibri" w:cs="Calibri" w:eastAsia="Calibri" w:hAnsi="Calibri"/>
+                <w:b w:val="false"/>
+                <w:bCs w:val="false"/>
+                <w:color w:val="212121"/>
+                <w:sz w:val="20"/>
+                <w:szCs w:val="20"/>
+              </w:rPr>
+              <w:t xml:space="preserve">0.024</w:t>
+            </w:r>
+          </w:p>
+        </w:tc>
+        <w:tc>
+          <w:tcPr>
+            <w:tcW w:type="dxa" w:w="1638"/>
+            <w:tcMar>
+              <w:top w:type="dxa" w:w="60"/>
+              <w:left w:type="dxa" w:w="110"/>
+              <w:bottom w:type="dxa" w:w="60"/>
+              <w:right w:type="dxa" w:w="110"/>
+            </w:tcMar>
+            <w:vAlign w:val="center"/>
+          </w:tcPr>
+          <w:p>
+            <w:pPr>
+              <w:spacing w:after="40" w:before="40"/>
+            </w:pPr>
+            <w:r>
+              <w:rPr>
+                <w:rFonts w:ascii="Calibri" w:cs="Calibri" w:eastAsia="Calibri" w:hAnsi="Calibri"/>
+                <w:b w:val="false"/>
+                <w:bCs w:val="false"/>
+                <w:color w:val="212121"/>
+                <w:sz w:val="20"/>
+                <w:szCs w:val="20"/>
+              </w:rPr>
+              <w:t xml:space="preserve">PASS</w:t>
+            </w:r>
+          </w:p>
+        </w:tc>
+      </w:tr>
+      <w:tr>
+        <w:tc>
+          <w:tcPr>
+            <w:tcW w:type="dxa" w:w="3276"/>
+            <w:tcMar>
+              <w:top w:type="dxa" w:w="60"/>
+              <w:left w:type="dxa" w:w="110"/>
+              <w:bottom w:type="dxa" w:w="60"/>
+              <w:right w:type="dxa" w:w="110"/>
+            </w:tcMar>
+            <w:vAlign w:val="center"/>
+          </w:tcPr>
+          <w:p>
+            <w:pPr>
+              <w:spacing w:after="40" w:before="40"/>
+            </w:pPr>
+            <w:r>
+              <w:rPr>
+                <w:rFonts w:ascii="Calibri" w:cs="Calibri" w:eastAsia="Calibri" w:hAnsi="Calibri"/>
+                <w:b w:val="false"/>
+                <w:bCs w:val="false"/>
+                <w:color w:val="212121"/>
+                <w:sz w:val="20"/>
+                <w:szCs w:val="20"/>
+              </w:rPr>
+              <w:t xml:space="preserve">FNR gap — crop</w:t>
+            </w:r>
+          </w:p>
+        </w:tc>
+        <w:tc>
+          <w:tcPr>
+            <w:tcW w:type="dxa" w:w="2340"/>
+            <w:tcMar>
+              <w:top w:type="dxa" w:w="60"/>
+              <w:left w:type="dxa" w:w="110"/>
+              <w:bottom w:type="dxa" w:w="60"/>
+              <w:right w:type="dxa" w:w="110"/>
+            </w:tcMar>
+            <w:vAlign w:val="center"/>
+          </w:tcPr>
+          <w:p>
+            <w:pPr>
+              <w:spacing w:after="40" w:before="40"/>
+            </w:pPr>
+            <w:r>
+              <w:rPr>
+                <w:rFonts w:ascii="Calibri" w:cs="Calibri" w:eastAsia="Calibri" w:hAnsi="Calibri"/>
+                <w:b w:val="false"/>
+                <w:bCs w:val="false"/>
+                <w:color w:val="212121"/>
+                <w:sz w:val="20"/>
+                <w:szCs w:val="20"/>
+              </w:rPr>
+              <w:t xml:space="preserve">&lt; 0.10</w:t>
+            </w:r>
+          </w:p>
+        </w:tc>
+        <w:tc>
+          <w:tcPr>
+            <w:tcW w:type="dxa" w:w="2106"/>
+            <w:tcMar>
+              <w:top w:type="dxa" w:w="60"/>
+              <w:left w:type="dxa" w:w="110"/>
+              <w:bottom w:type="dxa" w:w="60"/>
+              <w:right w:type="dxa" w:w="110"/>
+            </w:tcMar>
+            <w:vAlign w:val="center"/>
+          </w:tcPr>
+          <w:p>
+            <w:pPr>
+              <w:spacing w:after="40" w:before="40"/>
+            </w:pPr>
+            <w:r>
+              <w:rPr>
+                <w:rFonts w:ascii="Calibri" w:cs="Calibri" w:eastAsia="Calibri" w:hAnsi="Calibri"/>
+                <w:b w:val="false"/>
+                <w:bCs w:val="false"/>
+                <w:color w:val="212121"/>
+                <w:sz w:val="20"/>
+                <w:szCs w:val="20"/>
+              </w:rPr>
+              <w:t xml:space="preserve">0.074</w:t>
+            </w:r>
+          </w:p>
+        </w:tc>
+        <w:tc>
+          <w:tcPr>
+            <w:tcW w:type="dxa" w:w="1638"/>
+            <w:tcMar>
+              <w:top w:type="dxa" w:w="60"/>
+              <w:left w:type="dxa" w:w="110"/>
+              <w:bottom w:type="dxa" w:w="60"/>
+              <w:right w:type="dxa" w:w="110"/>
+            </w:tcMar>
+            <w:vAlign w:val="center"/>
+          </w:tcPr>
+          <w:p>
+            <w:pPr>
+              <w:spacing w:after="40" w:before="40"/>
+            </w:pPr>
+            <w:r>
+              <w:rPr>
+                <w:rFonts w:ascii="Calibri" w:cs="Calibri" w:eastAsia="Calibri" w:hAnsi="Calibri"/>
+                <w:b w:val="false"/>
+                <w:bCs w:val="false"/>
+                <w:color w:val="212121"/>
+                <w:sz w:val="20"/>
+                <w:szCs w:val="20"/>
+              </w:rPr>
+              <w:t xml:space="preserve">PASS</w:t>
+            </w:r>
+          </w:p>
+        </w:tc>
+      </w:tr>
+      <w:tr>
+        <w:tc>
+          <w:tcPr>
+            <w:tcW w:type="dxa" w:w="3276"/>
+            <w:tcMar>
+              <w:top w:type="dxa" w:w="60"/>
+              <w:left w:type="dxa" w:w="110"/>
+              <w:bottom w:type="dxa" w:w="60"/>
+              <w:right w:type="dxa" w:w="110"/>
+            </w:tcMar>
+            <w:vAlign w:val="center"/>
+          </w:tcPr>
+          <w:p>
+            <w:pPr>
+              <w:spacing w:after="40" w:before="40"/>
+            </w:pPr>
+            <w:r>
+              <w:rPr>
+                <w:rFonts w:ascii="Calibri" w:cs="Calibri" w:eastAsia="Calibri" w:hAnsi="Calibri"/>
+                <w:b w:val="false"/>
+                <w:bCs w:val="false"/>
+                <w:color w:val="212121"/>
+                <w:sz w:val="20"/>
+                <w:szCs w:val="20"/>
+              </w:rPr>
+              <w:t xml:space="preserve">MAE gap — region</w:t>
+            </w:r>
+          </w:p>
+        </w:tc>
+        <w:tc>
+          <w:tcPr>
+            <w:tcW w:type="dxa" w:w="2340"/>
+            <w:tcMar>
+              <w:top w:type="dxa" w:w="60"/>
+              <w:left w:type="dxa" w:w="110"/>
+              <w:bottom w:type="dxa" w:w="60"/>
+              <w:right w:type="dxa" w:w="110"/>
+            </w:tcMar>
+            <w:vAlign w:val="center"/>
+          </w:tcPr>
+          <w:p>
+            <w:pPr>
+              <w:spacing w:after="40" w:before="40"/>
+            </w:pPr>
+            <w:r>
+              <w:rPr>
+                <w:rFonts w:ascii="Calibri" w:cs="Calibri" w:eastAsia="Calibri" w:hAnsi="Calibri"/>
+                <w:b w:val="false"/>
+                <w:bCs w:val="false"/>
+                <w:color w:val="212121"/>
+                <w:sz w:val="20"/>
+                <w:szCs w:val="20"/>
+              </w:rPr>
+              <w:t xml:space="preserve">&lt; 2.0 points</w:t>
+            </w:r>
+          </w:p>
+        </w:tc>
+        <w:tc>
+          <w:tcPr>
+            <w:tcW w:type="dxa" w:w="2106"/>
+            <w:tcMar>
+              <w:top w:type="dxa" w:w="60"/>
+              <w:left w:type="dxa" w:w="110"/>
+              <w:bottom w:type="dxa" w:w="60"/>
+              <w:right w:type="dxa" w:w="110"/>
+            </w:tcMar>
+            <w:vAlign w:val="center"/>
+          </w:tcPr>
+          <w:p>
+            <w:pPr>
+              <w:spacing w:after="40" w:before="40"/>
+            </w:pPr>
+            <w:r>
+              <w:rPr>
+                <w:rFonts w:ascii="Calibri" w:cs="Calibri" w:eastAsia="Calibri" w:hAnsi="Calibri"/>
+                <w:b w:val="false"/>
+                <w:bCs w:val="false"/>
+                <w:color w:val="212121"/>
+                <w:sz w:val="20"/>
+                <w:szCs w:val="20"/>
+              </w:rPr>
+              <w:t xml:space="preserve">0.015</w:t>
+            </w:r>
+          </w:p>
+        </w:tc>
+        <w:tc>
+          <w:tcPr>
+            <w:tcW w:type="dxa" w:w="1638"/>
+            <w:tcMar>
+              <w:top w:type="dxa" w:w="60"/>
+              <w:left w:type="dxa" w:w="110"/>
+              <w:bottom w:type="dxa" w:w="60"/>
+              <w:right w:type="dxa" w:w="110"/>
+            </w:tcMar>
+            <w:vAlign w:val="center"/>
+          </w:tcPr>
+          <w:p>
+            <w:pPr>
+              <w:spacing w:after="40" w:before="40"/>
+            </w:pPr>
+            <w:r>
+              <w:rPr>
+                <w:rFonts w:ascii="Calibri" w:cs="Calibri" w:eastAsia="Calibri" w:hAnsi="Calibri"/>
+                <w:b w:val="false"/>
+                <w:bCs w:val="false"/>
+                <w:color w:val="212121"/>
+                <w:sz w:val="20"/>
+                <w:szCs w:val="20"/>
+              </w:rPr>
+              <w:t xml:space="preserve">PASS</w:t>
+            </w:r>
+          </w:p>
+        </w:tc>
+      </w:tr>
+      <w:tr>
+        <w:tc>
+          <w:tcPr>
+            <w:tcW w:type="dxa" w:w="3276"/>
+            <w:tcMar>
+              <w:top w:type="dxa" w:w="60"/>
+              <w:left w:type="dxa" w:w="110"/>
+              <w:bottom w:type="dxa" w:w="60"/>
+              <w:right w:type="dxa" w:w="110"/>
+            </w:tcMar>
+            <w:vAlign w:val="center"/>
+          </w:tcPr>
+          <w:p>
+            <w:pPr>
+              <w:spacing w:after="40" w:before="40"/>
+            </w:pPr>
+            <w:r>
+              <w:rPr>
+                <w:rFonts w:ascii="Calibri" w:cs="Calibri" w:eastAsia="Calibri" w:hAnsi="Calibri"/>
+                <w:b w:val="false"/>
+                <w:bCs w:val="false"/>
+                <w:color w:val="212121"/>
+                <w:sz w:val="20"/>
+                <w:szCs w:val="20"/>
+              </w:rPr>
+              <w:t xml:space="preserve">MAE gap — crop</w:t>
+            </w:r>
+          </w:p>
+        </w:tc>
+        <w:tc>
+          <w:tcPr>
+            <w:tcW w:type="dxa" w:w="2340"/>
+            <w:tcMar>
+              <w:top w:type="dxa" w:w="60"/>
+              <w:left w:type="dxa" w:w="110"/>
+              <w:bottom w:type="dxa" w:w="60"/>
+              <w:right w:type="dxa" w:w="110"/>
+            </w:tcMar>
+            <w:vAlign w:val="center"/>
+          </w:tcPr>
+          <w:p>
+            <w:pPr>
+              <w:spacing w:after="40" w:before="40"/>
+            </w:pPr>
+            <w:r>
+              <w:rPr>
+                <w:rFonts w:ascii="Calibri" w:cs="Calibri" w:eastAsia="Calibri" w:hAnsi="Calibri"/>
+                <w:b w:val="false"/>
+                <w:bCs w:val="false"/>
+                <w:color w:val="212121"/>
+                <w:sz w:val="20"/>
+                <w:szCs w:val="20"/>
+              </w:rPr>
+              <w:t xml:space="preserve">&lt; 2.0 points</w:t>
+            </w:r>
+          </w:p>
+        </w:tc>
+        <w:tc>
+          <w:tcPr>
+            <w:tcW w:type="dxa" w:w="2106"/>
+            <w:tcMar>
+              <w:top w:type="dxa" w:w="60"/>
+              <w:left w:type="dxa" w:w="110"/>
+              <w:bottom w:type="dxa" w:w="60"/>
+              <w:right w:type="dxa" w:w="110"/>
+            </w:tcMar>
+            <w:vAlign w:val="center"/>
+          </w:tcPr>
+          <w:p>
+            <w:pPr>
+              <w:spacing w:after="40" w:before="40"/>
+            </w:pPr>
+            <w:r>
+              <w:rPr>
+                <w:rFonts w:ascii="Calibri" w:cs="Calibri" w:eastAsia="Calibri" w:hAnsi="Calibri"/>
+                <w:b w:val="false"/>
+                <w:bCs w:val="false"/>
+                <w:color w:val="212121"/>
+                <w:sz w:val="20"/>
+                <w:szCs w:val="20"/>
+              </w:rPr>
+              <w:t xml:space="preserve">0.23</w:t>
+            </w:r>
+          </w:p>
+        </w:tc>
+        <w:tc>
+          <w:tcPr>
+            <w:tcW w:type="dxa" w:w="1638"/>
+            <w:tcMar>
+              <w:top w:type="dxa" w:w="60"/>
+              <w:left w:type="dxa" w:w="110"/>
+              <w:bottom w:type="dxa" w:w="60"/>
+              <w:right w:type="dxa" w:w="110"/>
+            </w:tcMar>
+            <w:vAlign w:val="center"/>
+          </w:tcPr>
+          <w:p>
+            <w:pPr>
+              <w:spacing w:after="40" w:before="40"/>
+            </w:pPr>
+            <w:r>
+              <w:rPr>
+                <w:rFonts w:ascii="Calibri" w:cs="Calibri" w:eastAsia="Calibri" w:hAnsi="Calibri"/>
+                <w:b w:val="false"/>
+                <w:bCs w:val="false"/>
+                <w:color w:val="212121"/>
+                <w:sz w:val="20"/>
+                <w:szCs w:val="20"/>
+              </w:rPr>
+              <w:t xml:space="preserve">PASS</w:t>
+            </w:r>
+          </w:p>
+        </w:tc>
+      </w:tr>
+      <w:tr>
+        <w:tc>
+          <w:tcPr>
+            <w:tcW w:type="dxa" w:w="3276"/>
+            <w:tcMar>
+              <w:top w:type="dxa" w:w="60"/>
+              <w:left w:type="dxa" w:w="110"/>
+              <w:bottom w:type="dxa" w:w="60"/>
+              <w:right w:type="dxa" w:w="110"/>
+            </w:tcMar>
+            <w:vAlign w:val="center"/>
+          </w:tcPr>
+          <w:p>
+            <w:pPr>
+              <w:spacing w:after="40" w:before="40"/>
+            </w:pPr>
+            <w:r>
+              <w:rPr>
+                <w:rFonts w:ascii="Calibri" w:cs="Calibri" w:eastAsia="Calibri" w:hAnsi="Calibri"/>
+                <w:b w:val="false"/>
+                <w:bCs w:val="false"/>
+                <w:color w:val="212121"/>
+                <w:sz w:val="20"/>
+                <w:szCs w:val="20"/>
+              </w:rPr>
+              <w:t xml:space="preserve">Alert-rate gap</w:t>
+            </w:r>
+          </w:p>
+        </w:tc>
+        <w:tc>
+          <w:tcPr>
+            <w:tcW w:type="dxa" w:w="2340"/>
+            <w:tcMar>
+              <w:top w:type="dxa" w:w="60"/>
+              <w:left w:type="dxa" w:w="110"/>
+              <w:bottom w:type="dxa" w:w="60"/>
+              <w:right w:type="dxa" w:w="110"/>
+            </w:tcMar>
+            <w:vAlign w:val="center"/>
+          </w:tcPr>
+          <w:p>
+            <w:pPr>
+              <w:spacing w:after="40" w:before="40"/>
+            </w:pPr>
+            <w:r>
+              <w:rPr>
+                <w:rFonts w:ascii="Calibri" w:cs="Calibri" w:eastAsia="Calibri" w:hAnsi="Calibri"/>
+                <w:b w:val="false"/>
+                <w:bCs w:val="false"/>
+                <w:color w:val="212121"/>
+                <w:sz w:val="20"/>
+                <w:szCs w:val="20"/>
+              </w:rPr>
+              <w:t xml:space="preserve">monitored, not gated</w:t>
+            </w:r>
+          </w:p>
+        </w:tc>
+        <w:tc>
+          <w:tcPr>
+            <w:tcW w:type="dxa" w:w="2106"/>
+            <w:tcMar>
+              <w:top w:type="dxa" w:w="60"/>
+              <w:left w:type="dxa" w:w="110"/>
+              <w:bottom w:type="dxa" w:w="60"/>
+              <w:right w:type="dxa" w:w="110"/>
+            </w:tcMar>
+            <w:vAlign w:val="center"/>
+          </w:tcPr>
+          <w:p>
+            <w:pPr>
+              <w:spacing w:after="40" w:before="40"/>
+            </w:pPr>
+            <w:r>
+              <w:rPr>
+                <w:rFonts w:ascii="Calibri" w:cs="Calibri" w:eastAsia="Calibri" w:hAnsi="Calibri"/>
+                <w:b w:val="false"/>
+                <w:bCs w:val="false"/>
+                <w:color w:val="212121"/>
+                <w:sz w:val="20"/>
+                <w:szCs w:val="20"/>
+              </w:rPr>
+              <w:t xml:space="preserve">0.013 / 0.045</w:t>
+            </w:r>
+          </w:p>
+        </w:tc>
+        <w:tc>
+          <w:tcPr>
+            <w:tcW w:type="dxa" w:w="1638"/>
+            <w:tcMar>
+              <w:top w:type="dxa" w:w="60"/>
+              <w:left w:type="dxa" w:w="110"/>
+              <w:bottom w:type="dxa" w:w="60"/>
+              <w:right w:type="dxa" w:w="110"/>
+            </w:tcMar>
+            <w:vAlign w:val="center"/>
+          </w:tcPr>
+          <w:p>
+            <w:pPr>
+              <w:spacing w:after="40" w:before="40"/>
+            </w:pPr>
+            <w:r>
+              <w:rPr>
+                <w:rFonts w:ascii="Calibri" w:cs="Calibri" w:eastAsia="Calibri" w:hAnsi="Calibri"/>
+                <w:b w:val="false"/>
+                <w:bCs w:val="false"/>
+                <w:color w:val="212121"/>
+                <w:sz w:val="20"/>
+                <w:szCs w:val="20"/>
+              </w:rPr>
+              <w:t xml:space="preserve">—</w:t>
+            </w:r>
+          </w:p>
+        </w:tc>
+      </w:tr>
+    </w:tbl>
+    <w:p>
+      <w:pPr>
+        <w:spacing w:after="60"/>
+      </w:pPr>
+    </w:p>
     <w:p>
       <w:pPr>
         <w:spacing w:after="160" w:before="0"/>
@@ -3761,7 +4541,7 @@
           <w:sz w:val="22"/>
           <w:szCs w:val="22"/>
         </w:rPr>
-        <w:t xml:space="preserve">All fairness gates pass. Full report: model/fairlearn_report.md in the repository, regenerated by model/fairlearn_report.py on every retrain.</w:t>
+        <w:t xml:space="preserve">Gates apply per metric: false-negative-rate gaps are gated at 0.10; MAE gaps (0–100 scale) at 2.0 points. The alert-rate difference is monitored but deliberately not gated — Marathwada's higher alert rate reflects its genuinely higher drought propensity, and equalizing it would suppress true alerts there. Full report: model/fairlearn_report.md, regenerated by model/fairlearn_report.py on every retrain.</w:t>
       </w:r>
     </w:p>
     <w:p>
@@ -3871,7 +4651,7 @@
           <w:sz w:val="22"/>
           <w:szCs w:val="22"/>
         </w:rPr>
-        <w:t xml:space="preserve">FSI is trained on synthetic-but-grounded data; a deployment pilot must recalibrate against observed distress outcomes before any resource-allocation use.</w:t>
+        <w:t xml:space="preserve">As stated in §4.2: the model's metrics measure internal consistency on synthetic data whose labels we generated — they are not evidence of real-world predictive power. The pilot (§8) exists precisely to produce that evidence before any resource-allocation use.</w:t>
       </w:r>
     </w:p>
     <w:p>
@@ -4798,7 +5578,7 @@
           <w:sz w:val="22"/>
           <w:szCs w:val="22"/>
         </w:rPr>
-        <w:t xml:space="preserve">2.  Whisper large-v3 transcribes (language auto-detected).</w:t>
+        <w:t xml:space="preserve">2.  ASR transcribes the note. Production path: Whisper large-v3 (hosted, free tier) — this is what runs in the demo. AI4Bharat IndicConformer is implemented as a configurable offline backend (ASR_BACKEND=ai4bharat) for the data-sovereign deployment described in §8; it is not the demo path.</w:t>
       </w:r>
     </w:p>
     <w:p>
@@ -4836,7 +5616,7 @@
           <w:sz w:val="22"/>
           <w:szCs w:val="22"/>
         </w:rPr>
-        <w:t xml:space="preserve">4.  Calm day (live data): FSI 20.9 LOW → honest all-clear reply in Marathi, no alert. The system does not cry wolf.</w:t>
+        <w:t xml:space="preserve">4.  Calm day (live data, 5 July 2026): rainfall deficit 10.6%, NDVI 0.331, FSI 20.9 LOW → honest all-clear reply in Marathi, no alert. The system does not cry wolf.</w:t>
       </w:r>
     </w:p>
     <w:p>
@@ -4855,7 +5635,7 @@
           <w:sz w:val="22"/>
           <w:szCs w:val="22"/>
         </w:rPr>
-        <w:t xml:space="preserve">5.  Crisis scenario (labeled simulation of Oct-Nov 2024 pattern): FSI 87.9 CRITICAL → officer WhatsApp alert with evidence + auto-drafted PMFBY claim letter in Marathi delivered back to the farmer.</w:t>
+        <w:t xml:space="preserve">5.  Crisis scenario — a clearly labeled simulation replaying the Oct–Nov 2024 stress pattern (drought signal 0.70, price 18% below MSP): FSI 87.9 CRITICAL → officer WhatsApp alert + auto-drafted PMFBY claim letter in Marathi delivered back to the farmer. Every simulated message carries a visible SIMULATION tag; the deliberate contrast between step 4's real numbers and step 5's simulated ones is part of the demo.</w:t>
       </w:r>
     </w:p>
     <w:p>
@@ -4905,7 +5685,21 @@
           <w:sz w:val="22"/>
           <w:szCs w:val="22"/>
         </w:rPr>
-        <w:t xml:space="preserve">"⚠ KisaanRaksha Alert: Amravati (Vidarbha) · FSI = 87.9 (CRITICAL) · Crop: cotton · Rainfall deficit: 57.4% · Market price ₹4,200/qtl (18% below MSP ₹7,710) · NDVI 0.39 · Est. 312 farmers in repayment window · Action: proactive outreach + PMFBY survey recommended."</w:t>
+        <w:t xml:space="preserve">"⚠ KisaanRaksha Alert: Amravati (Vidarbha) · FSI = 87.9 (CRITICAL) · Crop: cotton · Rainfall deficit: 57.4% · Market price ₹4,200/qtl (18% below MSP ₹7,710) · NDVI 0.39 · Loan-repayment window: ACTIVE · Action: proactive outreach + PMFBY survey recommended · [SIMULATION — replays Oct-Nov 2024 Vidarbha stress pattern, not live data]"</w:t>
+      </w:r>
+    </w:p>
+    <w:p>
+      <w:pPr>
+        <w:spacing w:after="160" w:before="0"/>
+      </w:pPr>
+      <w:r>
+        <w:rPr>
+          <w:rFonts w:ascii="Calibri" w:cs="Calibri" w:eastAsia="Calibri" w:hAnsi="Calibri"/>
+          <w:color w:val="212121"/>
+          <w:sz w:val="22"/>
+          <w:szCs w:val="22"/>
+        </w:rPr>
+        <w:t xml:space="preserve">Farmer-count integration (how many farmers are in the repayment window per taluka) requires the Krishi Vibhag crop-loan roster and is scoped as a pilot deliverable — the alert states only what the system has actually derived.</w:t>
       </w:r>
     </w:p>
     <w:p>
@@ -5173,7 +5967,7 @@
                 <w:sz w:val="20"/>
                 <w:szCs w:val="20"/>
               </w:rPr>
-              <w:t xml:space="preserve">Python · FastMCP · FastAPI · LightGBM · Fairlearn · Whisper/AI4Bharat ASR · Twilio WhatsApp · Streamlit · SQLite</w:t>
+              <w:t xml:space="preserve">Python · FastMCP · FastAPI · LightGBM · Fairlearn · ASR: Whisper large-v3 in production demo, AI4Bharat IndicConformer as implemented offline backend · Twilio WhatsApp · Streamlit · SQLite</w:t>
             </w:r>
           </w:p>
         </w:tc>

</xml_diff>

<commit_message>
Dashboard v3.1: sticky glass topbar nav, back arrow, full green glassmorphism, pro type system
- Sticky top navigation bar (Home / Districts / Field activity / About) with
  active-page pill highlight and brand link, glass recipe with sheen
- Circular back-arrow button (browser history) on every page
- True green glassmorphism: gradient glass fills, blur+saturate backdrop,
  white glass edges, hover sheen sweep on KPI cards, richer mesh background
  so the blur is visible; text contrast preserved
- Typography system: Sora (headings) / Inter (body & UI) / Space Grotesk
  (numerals & metrics)
- Team name Pranav Shripannavar added to About page + Round 1 solution doc
  (docx + PDF regenerated)

Co-Authored-By: Pranav Shripannavar <shripannavarpranav@gmail.com>
</commit_message>
<xml_diff>
--- a/docs/KisaanRaksha_Round1_Solution.docx
+++ b/docs/KisaanRaksha_Round1_Solution.docx
@@ -146,7 +146,7 @@
           <w:sz w:val="24"/>
           <w:szCs w:val="24"/>
         </w:rPr>
-        <w:t xml:space="preserve">Team:  Sahil Karande  ·  [Teammate Name]</w:t>
+        <w:t xml:space="preserve">Team:  Sahil Karande  ·  Pranav Shripannavar</w:t>
       </w:r>
     </w:p>
     <w:p>
@@ -5851,7 +5851,7 @@
                 <w:sz w:val="20"/>
                 <w:szCs w:val="20"/>
               </w:rPr>
-              <w:t xml:space="preserve">Sahil Karande · [Teammate Name] — 2 members</w:t>
+              <w:t xml:space="preserve">Sahil Karande · Pranav Shripannavar — 2 members</w:t>
             </w:r>
           </w:p>
         </w:tc>

</xml_diff>